<commit_message>
Start set up of inputs
</commit_message>
<xml_diff>
--- a/Non Code Items/Documents/F2024_Artificial Intelligence Usage Record.docx
+++ b/Non Code Items/Documents/F2024_Artificial Intelligence Usage Record.docx
@@ -1,6 +1,6 @@
 
 <file path=word/document.xml><?xml version="1.0" encoding="utf-8"?>
-<w:document xmlns:wpc="http://schemas.microsoft.com/office/word/2010/wordprocessingCanvas" xmlns:cx="http://schemas.microsoft.com/office/drawing/2014/chartex" xmlns:cx1="http://schemas.microsoft.com/office/drawing/2015/9/8/chartex" xmlns:cx2="http://schemas.microsoft.com/office/drawing/2015/10/21/chartex" xmlns:cx3="http://schemas.microsoft.com/office/drawing/2016/5/9/chartex" xmlns:cx4="http://schemas.microsoft.com/office/drawing/2016/5/10/chartex" xmlns:cx5="http://schemas.microsoft.com/office/drawing/2016/5/11/chartex" xmlns:cx6="http://schemas.microsoft.com/office/drawing/2016/5/12/chartex" xmlns:cx7="http://schemas.microsoft.com/office/drawing/2016/5/13/chartex" xmlns:cx8="http://schemas.microsoft.com/office/drawing/2016/5/14/chartex" xmlns:mc="http://schemas.openxmlformats.org/markup-compatibility/2006" xmlns:m="http://schemas.openxmlformats.org/officeDocument/2006/math" xmlns:aink="http://schemas.microsoft.com/office/drawing/2016/ink" xmlns:am3d="http://schemas.microsoft.com/office/drawing/2017/model3d" xmlns:oel="http://schemas.microsoft.com/office/2019/extlst" xmlns:r="http://schemas.openxmlformats.org/officeDocument/2006/relationships" xmlns:wp14="http://schemas.microsoft.com/office/word/2010/wordprocessingDrawing" xmlns:wp="http://schemas.openxmlformats.org/drawingml/2006/wordprocessingDrawing" xmlns:wpg="http://schemas.microsoft.com/office/word/2010/wordprocessingGroup" xmlns:wpi="http://schemas.microsoft.com/office/word/2010/wordprocessingInk" xmlns:wps="http://schemas.microsoft.com/office/word/2010/wordprocessingShape" xmlns:o="urn:schemas-microsoft-com:office:office" xmlns:v="urn:schemas-microsoft-com:vml" xmlns:w10="urn:schemas-microsoft-com:office:word" xmlns:w="http://schemas.openxmlformats.org/wordprocessingml/2006/main" xmlns:w14="http://schemas.microsoft.com/office/word/2010/wordml" xmlns:w15="http://schemas.microsoft.com/office/word/2012/wordml" xmlns:w16cex="http://schemas.microsoft.com/office/word/2018/wordml/cex" xmlns:w16cid="http://schemas.microsoft.com/office/word/2016/wordml/cid" xmlns:w16="http://schemas.microsoft.com/office/word/2018/wordml" xmlns:w16sdtdh="http://schemas.microsoft.com/office/word/2020/wordml/sdtdatahash" xmlns:w16sdtfl="http://schemas.microsoft.com/office/word/2024/wordml/sdtformatlock" xmlns:w16se="http://schemas.microsoft.com/office/word/2015/wordml/symex" xmlns:w16du="http://schemas.microsoft.com/office/word/2023/wordml/word16du" xmlns:wne="http://schemas.microsoft.com/office/word/2006/wordml" mc:Ignorable="w14 w15 w16se w16cid w16 w16cex w16sdtdh w16sdtfl w16du wp14">
+<w:document xmlns:wpc="http://schemas.microsoft.com/office/word/2010/wordprocessingCanvas" xmlns:cx="http://schemas.microsoft.com/office/drawing/2014/chartex" xmlns:cx1="http://schemas.microsoft.com/office/drawing/2015/9/8/chartex" xmlns:cx2="http://schemas.microsoft.com/office/drawing/2015/10/21/chartex" xmlns:cx3="http://schemas.microsoft.com/office/drawing/2016/5/9/chartex" xmlns:cx4="http://schemas.microsoft.com/office/drawing/2016/5/10/chartex" xmlns:cx5="http://schemas.microsoft.com/office/drawing/2016/5/11/chartex" xmlns:cx6="http://schemas.microsoft.com/office/drawing/2016/5/12/chartex" xmlns:cx7="http://schemas.microsoft.com/office/drawing/2016/5/13/chartex" xmlns:cx8="http://schemas.microsoft.com/office/drawing/2016/5/14/chartex" xmlns:mc="http://schemas.openxmlformats.org/markup-compatibility/2006" xmlns:aink="http://schemas.microsoft.com/office/drawing/2016/ink" xmlns:am3d="http://schemas.microsoft.com/office/drawing/2017/model3d" xmlns:o="urn:schemas-microsoft-com:office:office" xmlns:oel="http://schemas.microsoft.com/office/2019/extlst" xmlns:r="http://schemas.openxmlformats.org/officeDocument/2006/relationships" xmlns:m="http://schemas.openxmlformats.org/officeDocument/2006/math" xmlns:v="urn:schemas-microsoft-com:vml" xmlns:wp14="http://schemas.microsoft.com/office/word/2010/wordprocessingDrawing" xmlns:wp="http://schemas.openxmlformats.org/drawingml/2006/wordprocessingDrawing" xmlns:w10="urn:schemas-microsoft-com:office:word" xmlns:w="http://schemas.openxmlformats.org/wordprocessingml/2006/main" xmlns:w14="http://schemas.microsoft.com/office/word/2010/wordml" xmlns:w15="http://schemas.microsoft.com/office/word/2012/wordml" xmlns:w16cex="http://schemas.microsoft.com/office/word/2018/wordml/cex" xmlns:w16cid="http://schemas.microsoft.com/office/word/2016/wordml/cid" xmlns:w16="http://schemas.microsoft.com/office/word/2018/wordml" xmlns:w16du="http://schemas.microsoft.com/office/word/2023/wordml/word16du" xmlns:w16sdtdh="http://schemas.microsoft.com/office/word/2020/wordml/sdtdatahash" xmlns:w16sdtfl="http://schemas.microsoft.com/office/word/2024/wordml/sdtformatlock" xmlns:w16se="http://schemas.microsoft.com/office/word/2015/wordml/symex" xmlns:wpg="http://schemas.microsoft.com/office/word/2010/wordprocessingGroup" xmlns:wpi="http://schemas.microsoft.com/office/word/2010/wordprocessingInk" xmlns:wne="http://schemas.microsoft.com/office/word/2006/wordml" xmlns:wps="http://schemas.microsoft.com/office/word/2010/wordprocessingShape" mc:Ignorable="w14 w15 w16se w16cid w16 w16cex w16sdtdh w16sdtfl w16du wp14">
   <w:body>
     <w:p>
       <w:pPr>
@@ -185,7 +185,7 @@
                 <w:sz w:val="22"/>
                 <w:szCs w:val="22"/>
               </w:rPr>
-              <w:t xml:space="preserve">(Follow up Question: Would it be considered a </w:t>
+              <w:t>(Follow up Question: Would it be considered a one-to-one relationship)</w:t>
             </w:r>
             <w:r>
               <w:rPr>
@@ -194,26 +194,32 @@
                 <w:sz w:val="22"/>
                 <w:szCs w:val="22"/>
               </w:rPr>
-              <w:t>one-to-one</w:t>
-            </w:r>
-            <w:r>
+              <w:t xml:space="preserve">. </w:t>
+            </w:r>
+          </w:p>
+          <w:p>
+            <w:pPr>
+              <w:pStyle w:val="NormalWeb"/>
+              <w:spacing w:before="0" w:beforeAutospacing="0" w:after="0" w:afterAutospacing="0"/>
               <w:rPr>
                 <w:rFonts w:ascii="Arial" w:hAnsi="Arial" w:cs="Arial"/>
                 <w:color w:val="000000"/>
                 <w:sz w:val="22"/>
                 <w:szCs w:val="22"/>
               </w:rPr>
-              <w:t xml:space="preserve"> relationship)</w:t>
-            </w:r>
-            <w:r>
+            </w:pPr>
+          </w:p>
+          <w:p>
+            <w:pPr>
+              <w:pStyle w:val="NormalWeb"/>
+              <w:spacing w:before="0" w:beforeAutospacing="0" w:after="0" w:afterAutospacing="0"/>
               <w:rPr>
                 <w:rFonts w:ascii="Arial" w:hAnsi="Arial" w:cs="Arial"/>
                 <w:color w:val="000000"/>
                 <w:sz w:val="22"/>
                 <w:szCs w:val="22"/>
               </w:rPr>
-              <w:t xml:space="preserve">. </w:t>
-            </w:r>
+            </w:pPr>
           </w:p>
           <w:p>
             <w:pPr>
@@ -262,37 +268,13 @@
                 <w:szCs w:val="22"/>
               </w:rPr>
             </w:pPr>
-          </w:p>
-          <w:p>
-            <w:pPr>
-              <w:pStyle w:val="NormalWeb"/>
-              <w:spacing w:before="0" w:beforeAutospacing="0" w:after="0" w:afterAutospacing="0"/>
+            <w:r>
               <w:rPr>
                 <w:rFonts w:ascii="Arial" w:hAnsi="Arial" w:cs="Arial"/>
                 <w:color w:val="000000"/>
                 <w:sz w:val="22"/>
                 <w:szCs w:val="22"/>
               </w:rPr>
-            </w:pPr>
-          </w:p>
-          <w:p>
-            <w:pPr>
-              <w:pStyle w:val="NormalWeb"/>
-              <w:spacing w:before="0" w:beforeAutospacing="0" w:after="0" w:afterAutospacing="0"/>
-              <w:rPr>
-                <w:rFonts w:ascii="Arial" w:hAnsi="Arial" w:cs="Arial"/>
-                <w:color w:val="000000"/>
-                <w:sz w:val="22"/>
-                <w:szCs w:val="22"/>
-              </w:rPr>
-            </w:pPr>
-            <w:r>
-              <w:rPr>
-                <w:rFonts w:ascii="Arial" w:hAnsi="Arial" w:cs="Arial"/>
-                <w:color w:val="000000"/>
-                <w:sz w:val="22"/>
-                <w:szCs w:val="22"/>
-              </w:rPr>
               <w:t>What would be appropriate data types for the tables?</w:t>
             </w:r>
           </w:p>
@@ -350,25 +332,68 @@
           <w:tcPr>
             <w:tcW w:w="2337" w:type="dxa"/>
           </w:tcPr>
-          <w:p/>
+          <w:p>
+            <w:r>
+              <w:lastRenderedPageBreak/>
+              <w:t>Steve Mutrux</w:t>
+            </w:r>
+          </w:p>
         </w:tc>
         <w:tc>
           <w:tcPr>
             <w:tcW w:w="2337" w:type="dxa"/>
           </w:tcPr>
-          <w:p/>
+          <w:p>
+            <w:r>
+              <w:t>Create form</w:t>
+            </w:r>
+          </w:p>
         </w:tc>
         <w:tc>
           <w:tcPr>
             <w:tcW w:w="2338" w:type="dxa"/>
           </w:tcPr>
+          <w:p>
+            <w:pPr>
+              <w:rPr>
+                <w:lang w:val="en-CA"/>
+              </w:rPr>
+            </w:pPr>
+            <w:r>
+              <w:rPr>
+                <w:lang w:val="en-CA"/>
+              </w:rPr>
+              <w:t xml:space="preserve">Given this data model, the NCR itself, and the document, which inputs should appear in a form that creates an entry in the tables? This is for a web project, so I need a list of html-compatible inputs and some details about them: input name, input type, requires, and other details if any. Don't write code, give </w:t>
+            </w:r>
+            <w:proofErr w:type="gramStart"/>
+            <w:r>
+              <w:rPr>
+                <w:lang w:val="en-CA"/>
+              </w:rPr>
+              <w:t>an</w:t>
+            </w:r>
+            <w:proofErr w:type="gramEnd"/>
+            <w:r>
+              <w:rPr>
+                <w:lang w:val="en-CA"/>
+              </w:rPr>
+              <w:t xml:space="preserve"> list with all inputs in order.</w:t>
+            </w:r>
+          </w:p>
           <w:p/>
         </w:tc>
         <w:tc>
           <w:tcPr>
             <w:tcW w:w="2338" w:type="dxa"/>
           </w:tcPr>
-          <w:p/>
+          <w:p>
+            <w:r>
+              <w:t xml:space="preserve">Used output to inform decision </w:t>
+            </w:r>
+            <w:r>
+              <w:t>on what order to have the form inputs and how to break up the monstrously long form.</w:t>
+            </w:r>
+          </w:p>
         </w:tc>
       </w:tr>
       <w:tr>
@@ -462,7 +487,7 @@
 </file>
 
 <file path=word/styles.xml><?xml version="1.0" encoding="utf-8"?>
-<w:styles xmlns:mc="http://schemas.openxmlformats.org/markup-compatibility/2006" xmlns:r="http://schemas.openxmlformats.org/officeDocument/2006/relationships" xmlns:w="http://schemas.openxmlformats.org/wordprocessingml/2006/main" xmlns:w14="http://schemas.microsoft.com/office/word/2010/wordml" xmlns:w15="http://schemas.microsoft.com/office/word/2012/wordml" xmlns:w16cex="http://schemas.microsoft.com/office/word/2018/wordml/cex" xmlns:w16cid="http://schemas.microsoft.com/office/word/2016/wordml/cid" xmlns:w16="http://schemas.microsoft.com/office/word/2018/wordml" xmlns:w16sdtdh="http://schemas.microsoft.com/office/word/2020/wordml/sdtdatahash" xmlns:w16sdtfl="http://schemas.microsoft.com/office/word/2024/wordml/sdtformatlock" xmlns:w16se="http://schemas.microsoft.com/office/word/2015/wordml/symex" xmlns:w16du="http://schemas.microsoft.com/office/word/2023/wordml/word16du" mc:Ignorable="w14 w15 w16se w16cid w16 w16cex w16sdtdh w16sdtfl w16du">
+<w:styles xmlns:mc="http://schemas.openxmlformats.org/markup-compatibility/2006" xmlns:r="http://schemas.openxmlformats.org/officeDocument/2006/relationships" xmlns:w="http://schemas.openxmlformats.org/wordprocessingml/2006/main" xmlns:w14="http://schemas.microsoft.com/office/word/2010/wordml" xmlns:w15="http://schemas.microsoft.com/office/word/2012/wordml" xmlns:w16cex="http://schemas.microsoft.com/office/word/2018/wordml/cex" xmlns:w16cid="http://schemas.microsoft.com/office/word/2016/wordml/cid" xmlns:w16="http://schemas.microsoft.com/office/word/2018/wordml" xmlns:w16du="http://schemas.microsoft.com/office/word/2023/wordml/word16du" xmlns:w16sdtdh="http://schemas.microsoft.com/office/word/2020/wordml/sdtdatahash" xmlns:w16sdtfl="http://schemas.microsoft.com/office/word/2024/wordml/sdtformatlock" xmlns:w16se="http://schemas.microsoft.com/office/word/2015/wordml/symex" mc:Ignorable="w14 w15 w16se w16cid w16 w16cex w16sdtdh w16sdtfl w16du">
   <w:docDefaults>
     <w:rPrDefault>
       <w:rPr>
@@ -886,7 +911,6 @@
   <w:style w:type="character" w:default="1" w:styleId="DefaultParagraphFont">
     <w:name w:val="Default Paragraph Font"/>
     <w:uiPriority w:val="1"/>
-    <w:semiHidden/>
     <w:unhideWhenUsed/>
   </w:style>
   <w:style w:type="table" w:default="1" w:styleId="TableNormal">

</xml_diff>

<commit_message>
Mock up form on page
</commit_message>
<xml_diff>
--- a/Non Code Items/Documents/F2024_Artificial Intelligence Usage Record.docx
+++ b/Non Code Items/Documents/F2024_Artificial Intelligence Usage Record.docx
@@ -347,6 +347,9 @@
             <w:r>
               <w:t>Create form</w:t>
             </w:r>
+            <w:r>
+              <w:t xml:space="preserve"> inputs</w:t>
+            </w:r>
           </w:p>
         </w:tc>
         <w:tc>
@@ -363,21 +366,7 @@
               <w:rPr>
                 <w:lang w:val="en-CA"/>
               </w:rPr>
-              <w:t xml:space="preserve">Given this data model, the NCR itself, and the document, which inputs should appear in a form that creates an entry in the tables? This is for a web project, so I need a list of html-compatible inputs and some details about them: input name, input type, requires, and other details if any. Don't write code, give </w:t>
-            </w:r>
-            <w:proofErr w:type="gramStart"/>
-            <w:r>
-              <w:rPr>
-                <w:lang w:val="en-CA"/>
-              </w:rPr>
-              <w:t>an</w:t>
-            </w:r>
-            <w:proofErr w:type="gramEnd"/>
-            <w:r>
-              <w:rPr>
-                <w:lang w:val="en-CA"/>
-              </w:rPr>
-              <w:t xml:space="preserve"> list with all inputs in order.</w:t>
+              <w:t>Given this data model, the NCR itself, and the document, which inputs should appear in a form that creates an entry in the tables? This is for a web project, so I need a list of html-compatible inputs and some details about them: input name, input type, requires, and other details if any. Don't write code, give an list with all inputs in order.</w:t>
             </w:r>
           </w:p>
           <w:p/>
@@ -401,25 +390,51 @@
           <w:tcPr>
             <w:tcW w:w="2337" w:type="dxa"/>
           </w:tcPr>
-          <w:p/>
+          <w:p>
+            <w:r>
+              <w:t>Steve Mutrux</w:t>
+            </w:r>
+          </w:p>
         </w:tc>
         <w:tc>
           <w:tcPr>
             <w:tcW w:w="2337" w:type="dxa"/>
           </w:tcPr>
-          <w:p/>
+          <w:p>
+            <w:r>
+              <w:t>New NCR form</w:t>
+            </w:r>
+          </w:p>
         </w:tc>
         <w:tc>
           <w:tcPr>
             <w:tcW w:w="2338" w:type="dxa"/>
           </w:tcPr>
-          <w:p/>
+          <w:p>
+            <w:r>
+              <w:t>Using this input component, create a form and break it up into reasonable sections. The form should collect all the information necessary, pre-populate fields if possible or use sensible placeholders. Keep wcag requirements for AA and best practices in mind but target AAA if possible.</w:t>
+            </w:r>
+            <w:r>
+              <w:br/>
+              <w:t>There is no backend yet, so just output content to console on submit. Save each section so fi the page reloads or the form resets, the previous sections can get recalled from a cookie or localstorage.</w:t>
+            </w:r>
+          </w:p>
         </w:tc>
         <w:tc>
           <w:tcPr>
             <w:tcW w:w="2338" w:type="dxa"/>
           </w:tcPr>
-          <w:p/>
+          <w:p>
+            <w:r>
+              <w:t xml:space="preserve">Pasted </w:t>
+            </w:r>
+            <w:r>
+              <w:t xml:space="preserve">the resulting files directly into project, adapting the code where needed to match up the endpoints and </w:t>
+            </w:r>
+            <w:r>
+              <w:t>make database calls succeed.</w:t>
+            </w:r>
+          </w:p>
         </w:tc>
       </w:tr>
       <w:tr>
@@ -484,6 +499,10 @@
     </w:sectPr>
   </w:body>
 </w:document>
+</file>
+
+<file path=word/numbering.xml><?xml version="1.0" encoding="utf-8"?>
+<w:numbering xmlns:wpc="http://schemas.microsoft.com/office/word/2010/wordprocessingCanvas" xmlns:cx="http://schemas.microsoft.com/office/drawing/2014/chartex" xmlns:cx1="http://schemas.microsoft.com/office/drawing/2015/9/8/chartex" xmlns:cx2="http://schemas.microsoft.com/office/drawing/2015/10/21/chartex" xmlns:cx3="http://schemas.microsoft.com/office/drawing/2016/5/9/chartex" xmlns:cx4="http://schemas.microsoft.com/office/drawing/2016/5/10/chartex" xmlns:cx5="http://schemas.microsoft.com/office/drawing/2016/5/11/chartex" xmlns:cx6="http://schemas.microsoft.com/office/drawing/2016/5/12/chartex" xmlns:cx7="http://schemas.microsoft.com/office/drawing/2016/5/13/chartex" xmlns:cx8="http://schemas.microsoft.com/office/drawing/2016/5/14/chartex" xmlns:mc="http://schemas.openxmlformats.org/markup-compatibility/2006" xmlns:aink="http://schemas.microsoft.com/office/drawing/2016/ink" xmlns:am3d="http://schemas.microsoft.com/office/drawing/2017/model3d" xmlns:o="urn:schemas-microsoft-com:office:office" xmlns:oel="http://schemas.microsoft.com/office/2019/extlst" xmlns:r="http://schemas.openxmlformats.org/officeDocument/2006/relationships" xmlns:m="http://schemas.openxmlformats.org/officeDocument/2006/math" xmlns:v="urn:schemas-microsoft-com:vml" xmlns:wp14="http://schemas.microsoft.com/office/word/2010/wordprocessingDrawing" xmlns:wp="http://schemas.openxmlformats.org/drawingml/2006/wordprocessingDrawing" xmlns:w10="urn:schemas-microsoft-com:office:word" xmlns:w="http://schemas.openxmlformats.org/wordprocessingml/2006/main" xmlns:w14="http://schemas.microsoft.com/office/word/2010/wordml" xmlns:w15="http://schemas.microsoft.com/office/word/2012/wordml" xmlns:w16cex="http://schemas.microsoft.com/office/word/2018/wordml/cex" xmlns:w16cid="http://schemas.microsoft.com/office/word/2016/wordml/cid" xmlns:w16="http://schemas.microsoft.com/office/word/2018/wordml" xmlns:w16du="http://schemas.microsoft.com/office/word/2023/wordml/word16du" xmlns:w16sdtdh="http://schemas.microsoft.com/office/word/2020/wordml/sdtdatahash" xmlns:w16sdtfl="http://schemas.microsoft.com/office/word/2024/wordml/sdtformatlock" xmlns:w16se="http://schemas.microsoft.com/office/word/2015/wordml/symex" xmlns:wpg="http://schemas.microsoft.com/office/word/2010/wordprocessingGroup" xmlns:wpi="http://schemas.microsoft.com/office/word/2010/wordprocessingInk" xmlns:wne="http://schemas.microsoft.com/office/word/2006/wordml" xmlns:wps="http://schemas.microsoft.com/office/word/2010/wordprocessingShape" mc:Ignorable="w14 w15 w16se w16cid w16 w16cex w16sdtdh w16sdtfl w16du wp14"/>
 </file>
 
 <file path=word/styles.xml><?xml version="1.0" encoding="utf-8"?>

</xml_diff>

<commit_message>
Reports Page Fixes #9
</commit_message>
<xml_diff>
--- a/Non Code Items/Documents/F2024_Artificial Intelligence Usage Record.docx
+++ b/Non Code Items/Documents/F2024_Artificial Intelligence Usage Record.docx
@@ -442,25 +442,42 @@
           <w:tcPr>
             <w:tcW w:w="2337" w:type="dxa"/>
           </w:tcPr>
-          <w:p/>
+          <w:p>
+            <w:r>
+              <w:lastRenderedPageBreak/>
+              <w:t>Steve Mutrx</w:t>
+            </w:r>
+          </w:p>
         </w:tc>
         <w:tc>
           <w:tcPr>
             <w:tcW w:w="2337" w:type="dxa"/>
           </w:tcPr>
-          <w:p/>
+          <w:p>
+            <w:r>
+              <w:t>Reports page</w:t>
+            </w:r>
+          </w:p>
         </w:tc>
         <w:tc>
           <w:tcPr>
             <w:tcW w:w="2338" w:type="dxa"/>
           </w:tcPr>
-          <w:p/>
+          <w:p>
+            <w:r>
+              <w:t>Apart from open NCRs, closed, awaiting review, and total NCRs, what stats could be interesting for a reports page? After you figure that out, build this page in a way that respects the styling so far and incorporates the api calls on page to pass the relevant data to the status card.</w:t>
+            </w:r>
+          </w:p>
         </w:tc>
         <w:tc>
           <w:tcPr>
             <w:tcW w:w="2338" w:type="dxa"/>
           </w:tcPr>
-          <w:p/>
+          <w:p>
+            <w:r>
+              <w:t>Took inspiration from LLM and configured the page accordingly</w:t>
+            </w:r>
+          </w:p>
         </w:tc>
       </w:tr>
       <w:tr>

</xml_diff>